<commit_message>
SWDY: the bibliography named this repository, and a reader does not want a file path
CI caught this on my own fix from an hour ago. Correcting the source register's beta
row, I replaced the withdrawn composite with the index file the regression actually
reads — and printed its PATH IN THIS REPOSITORY on a page a reader receives.

The gate that caught it gives the remedy in its own words: rewrite the sentence, do
not add the path to a study-local list, because the next hole will be a different
shape. So the row names the index the way a reader would ask for it — EGX30, the
published index of the exchange this share is listed on — and the storage location it
happens to sit in here is not their business.

The register was already the RIGHT source; only the name was wrong. Re-run: 22
studies clean, no new leaks.

Co-Authored-By: Claude Opus 5 <noreply@anthropic.com>
Claude-Session: https://claude.ai/code/session_017RcjXG4ETjADcoFJf123yY
</commit_message>
<xml_diff>
--- a/engine/swdy_study/SWDY_Bibliography_09-09-2026.docx
+++ b/engine/swdy_study/SWDY_Bibliography_09-09-2026.docx
@@ -1077,7 +1077,7 @@
                 <w:color w:val="1C3A36"/>
                 <w:sz w:val="16"/>
               </w:rPr>
-              <w:t>Published index of the exchange this share is listed on</w:t>
+              <w:t>EGX30, the published index of the exchange this share is listed on</w:t>
             </w:r>
           </w:p>
         </w:tc>
@@ -1094,7 +1094,7 @@
                 <w:color w:val="1C3A36"/>
                 <w:sz w:val="16"/>
               </w:rPr>
-              <w:t>engine/raw_indices/EG/EGX30.csv</w:t>
+              <w:t>Published index series</w:t>
             </w:r>
           </w:p>
         </w:tc>

</xml_diff>

<commit_message>
SWDY delivered artefacts regenerated on the corrected model
The bibliography and workbook rebuilt against the study as it now stands: the reviewed
half's capex, the disclosed FY2024/FY2025 exchange-rate averages from note 44-3, and the
segment mix anchored on note 16's own comparable halves. The bibliography grows because
those figures are registered inputs now rather than typed constants.

Verified rather than assumed: recalc reports 594 of 594 formula cells reproducing the
model and 41 headline reconciliations passing.

Co-Authored-By: Claude Opus 5 <noreply@anthropic.com>
Claude-Session: https://claude.ai/code/session_017RcjXG4ETjADcoFJf123yY
</commit_message>
<xml_diff>
--- a/engine/swdy_study/SWDY_Bibliography_09-09-2026.docx
+++ b/engine/swdy_study/SWDY_Bibliography_09-09-2026.docx
@@ -1374,7 +1374,7 @@
           <w:color w:val="1C3A36"/>
           <w:sz w:val="22"/>
         </w:rPr>
-        <w:t>Company layer — 149 inputs</w:t>
+        <w:t>Company layer — 154 inputs</w:t>
       </w:r>
     </w:p>
     <w:tbl>
@@ -6098,7 +6098,7 @@
                 <w:color w:val="1C3A36"/>
                 <w:sz w:val="15"/>
               </w:rPr>
-              <w:t>Equity-accounted investees, carrying value, 31 Dec 2025 — the closing balance used in the valuation bridge (the anchor date is Aug-2026, so the FY2025 close is the most recent audited figure, not FY2024's)</w:t>
+              <w:t>Equity-accounted investees, carrying value, 31 Dec 2025 — the closing balance used in the valuation bridge (the anchor date is Aug-2026, so the FY2025 close is the most recent audited figure, not FY2024's). Note 20 names every investee and none is listed, so [R-BRIDGE-01] leaves book as the only route; the balance reconciles to the prior year through the disclosed 1,174.475 Senyar dividend and 135.317 of translation</w:t>
             </w:r>
           </w:p>
         </w:tc>
@@ -10107,7 +10107,7 @@
                 <w:color w:val="1C3A36"/>
                 <w:sz w:val="15"/>
               </w:rPr>
-              <w:t>foreign share fy25</w:t>
+              <w:t>fx hist</w:t>
             </w:r>
           </w:p>
         </w:tc>
@@ -10124,7 +10124,7 @@
                 <w:color w:val="1C3A36"/>
                 <w:sz w:val="15"/>
               </w:rPr>
-              <w:t>0.7</w:t>
+              <w:t>FY23: 30.59; FY24: 43.96; FY25: 47.69</w:t>
             </w:r>
           </w:p>
         </w:tc>
@@ -10158,7 +10158,7 @@
                 <w:color w:val="1C3A36"/>
                 <w:sz w:val="15"/>
               </w:rPr>
-              <w:t>'Over 70% of revenues generated abroad' (company commentary); the audited Note 5-2 geographic split gives Outside Egypt 40.7% of FY2025 revenue (114,461.030 / 281,049.082) — geography and hard-currency pricing are different questions, addressed explicitly below</w:t>
+              <w:t>Annual average USD/EGP, all three DISCLOSED by the issuer rather than estimated. FY2025 47.69 and FY2024 43.96 are note 44-3 of the FY2025 audited statements, 'significant foreign currency exchange rates during the year', average-rate columns; FY2023 30.59 is the FY2023 filing's own note 44-3-1. Revisions to 08-09-2026 typed 49.5 and 45.3 as house averages while the note sat in a filing this study already reads</w:t>
             </w:r>
           </w:p>
         </w:tc>
@@ -10177,6 +10177,76 @@
                 <w:color w:val="1C3A36"/>
                 <w:sz w:val="15"/>
               </w:rPr>
+              <w:t>foreign share fy25</w:t>
+            </w:r>
+          </w:p>
+        </w:tc>
+        <w:tc>
+          <w:tcPr>
+            <w:tcW w:type="dxa" w:w="1368"/>
+          </w:tcPr>
+          <w:p>
+            <w:pPr>
+              <w:spacing w:after="20"/>
+            </w:pPr>
+            <w:r>
+              <w:rPr>
+                <w:color w:val="1C3A36"/>
+                <w:sz w:val="15"/>
+              </w:rPr>
+              <w:t>0.7</w:t>
+            </w:r>
+          </w:p>
+        </w:tc>
+        <w:tc>
+          <w:tcPr>
+            <w:tcW w:type="dxa" w:w="1123"/>
+          </w:tcPr>
+          <w:p>
+            <w:pPr>
+              <w:spacing w:after="20"/>
+            </w:pPr>
+            <w:r>
+              <w:rPr>
+                <w:color w:val="1C3A36"/>
+                <w:sz w:val="15"/>
+              </w:rPr>
+              <w:t>2026-03-15</w:t>
+            </w:r>
+          </w:p>
+        </w:tc>
+        <w:tc>
+          <w:tcPr>
+            <w:tcW w:type="dxa" w:w="5933"/>
+          </w:tcPr>
+          <w:p>
+            <w:pPr>
+              <w:spacing w:after="20"/>
+            </w:pPr>
+            <w:r>
+              <w:rPr>
+                <w:color w:val="1C3A36"/>
+                <w:sz w:val="15"/>
+              </w:rPr>
+              <w:t>'Over 70% of revenues generated abroad' (company commentary); the audited Note 5-2 geographic split gives Outside Egypt 40.7% of FY2025 revenue (114,461.030 / 281,049.082) — geography and hard-currency pricing are different questions, addressed explicitly below</w:t>
+            </w:r>
+          </w:p>
+        </w:tc>
+      </w:tr>
+      <w:tr>
+        <w:tc>
+          <w:tcPr>
+            <w:tcW w:type="dxa" w:w="1656"/>
+          </w:tcPr>
+          <w:p>
+            <w:pPr>
+              <w:spacing w:after="20"/>
+            </w:pPr>
+            <w:r>
+              <w:rPr>
+                <w:color w:val="1C3A36"/>
+                <w:sz w:val="15"/>
+              </w:rPr>
               <w:t>fgn egp share fy25</w:t>
             </w:r>
           </w:p>
@@ -10229,6 +10299,286 @@
                 <w:sz w:val="15"/>
               </w:rPr>
               <w:t>Revenue earned OUTSIDE Egypt, FY2025, Note 5-2 (geographic disaggregation): 114,461.030219 / 281,049.081719 = 40.72%. This is the audited geographic split; the HARD-CURRENCY-LINKED share used in the currency-of-discounting alternative is derived separately below from the Cables segment's copper linkage, since a project executed abroad for a local utility is foreign revenue but not necessarily dollar-priced</w:t>
+            </w:r>
+          </w:p>
+        </w:tc>
+      </w:tr>
+      <w:tr>
+        <w:tc>
+          <w:tcPr>
+            <w:tcW w:type="dxa" w:w="1656"/>
+          </w:tcPr>
+          <w:p>
+            <w:pPr>
+              <w:spacing w:after="20"/>
+            </w:pPr>
+            <w:r>
+              <w:rPr>
+                <w:color w:val="1C3A36"/>
+                <w:sz w:val="15"/>
+              </w:rPr>
+              <w:t>capex h1 26</w:t>
+            </w:r>
+          </w:p>
+        </w:tc>
+        <w:tc>
+          <w:tcPr>
+            <w:tcW w:type="dxa" w:w="1368"/>
+          </w:tcPr>
+          <w:p>
+            <w:pPr>
+              <w:spacing w:after="20"/>
+            </w:pPr>
+            <w:r>
+              <w:rPr>
+                <w:color w:val="1C3A36"/>
+                <w:sz w:val="15"/>
+              </w:rPr>
+              <w:t>5,435.9</w:t>
+            </w:r>
+          </w:p>
+        </w:tc>
+        <w:tc>
+          <w:tcPr>
+            <w:tcW w:type="dxa" w:w="1123"/>
+          </w:tcPr>
+          <w:p>
+            <w:pPr>
+              <w:spacing w:after="20"/>
+            </w:pPr>
+            <w:r>
+              <w:rPr>
+                <w:color w:val="1C3A36"/>
+                <w:sz w:val="15"/>
+              </w:rPr>
+              <w:t>2026-06-30</w:t>
+            </w:r>
+          </w:p>
+        </w:tc>
+        <w:tc>
+          <w:tcPr>
+            <w:tcW w:type="dxa" w:w="5933"/>
+          </w:tcPr>
+          <w:p>
+            <w:pPr>
+              <w:spacing w:after="20"/>
+            </w:pPr>
+            <w:r>
+              <w:rPr>
+                <w:color w:val="1C3A36"/>
+                <w:sz w:val="15"/>
+              </w:rPr>
+              <w:t>Reviewed condensed interim consolidated financial statements for the six months ended 30 June 2026, El Sewedy Electric Company, approved for issuance by the board on 11 August 2026 (note 2-1), published on the company's own investor-relations portal at ir.elsewedyelectric.com, condensed interim consolidated statement of cash flows: 'Paid for acquisition of property, plant and equipment and projects under construction'</w:t>
+            </w:r>
+          </w:p>
+        </w:tc>
+      </w:tr>
+      <w:tr>
+        <w:tc>
+          <w:tcPr>
+            <w:tcW w:type="dxa" w:w="1656"/>
+          </w:tcPr>
+          <w:p>
+            <w:pPr>
+              <w:spacing w:after="20"/>
+            </w:pPr>
+            <w:r>
+              <w:rPr>
+                <w:color w:val="1C3A36"/>
+                <w:sz w:val="15"/>
+              </w:rPr>
+              <w:t>capex h1 25</w:t>
+            </w:r>
+          </w:p>
+        </w:tc>
+        <w:tc>
+          <w:tcPr>
+            <w:tcW w:type="dxa" w:w="1368"/>
+          </w:tcPr>
+          <w:p>
+            <w:pPr>
+              <w:spacing w:after="20"/>
+            </w:pPr>
+            <w:r>
+              <w:rPr>
+                <w:color w:val="1C3A36"/>
+                <w:sz w:val="15"/>
+              </w:rPr>
+              <w:t>5,386.8</w:t>
+            </w:r>
+          </w:p>
+        </w:tc>
+        <w:tc>
+          <w:tcPr>
+            <w:tcW w:type="dxa" w:w="1123"/>
+          </w:tcPr>
+          <w:p>
+            <w:pPr>
+              <w:spacing w:after="20"/>
+            </w:pPr>
+            <w:r>
+              <w:rPr>
+                <w:color w:val="1C3A36"/>
+                <w:sz w:val="15"/>
+              </w:rPr>
+              <w:t>2025-06-30</w:t>
+            </w:r>
+          </w:p>
+        </w:tc>
+        <w:tc>
+          <w:tcPr>
+            <w:tcW w:type="dxa" w:w="5933"/>
+          </w:tcPr>
+          <w:p>
+            <w:pPr>
+              <w:spacing w:after="20"/>
+            </w:pPr>
+            <w:r>
+              <w:rPr>
+                <w:color w:val="1C3A36"/>
+                <w:sz w:val="15"/>
+              </w:rPr>
+              <w:t>Reviewed condensed interim consolidated financial statements for the six months ended 30 June 2026, El Sewedy Electric Company, approved for issuance by the board on 11 August 2026 (note 2-1), published on the company's own investor-relations portal at ir.elsewedyelectric.com, same line, comparative column — and independently in the reviewed interim statements for the six months ended 30 June 2025, where it is the current-period figure. Two readings of one fact agreeing [R-ENF-03]</w:t>
+            </w:r>
+          </w:p>
+        </w:tc>
+      </w:tr>
+      <w:tr>
+        <w:tc>
+          <w:tcPr>
+            <w:tcW w:type="dxa" w:w="1656"/>
+          </w:tcPr>
+          <w:p>
+            <w:pPr>
+              <w:spacing w:after="20"/>
+            </w:pPr>
+            <w:r>
+              <w:rPr>
+                <w:color w:val="1C3A36"/>
+                <w:sz w:val="15"/>
+              </w:rPr>
+              <w:t>capex h1 24</w:t>
+            </w:r>
+          </w:p>
+        </w:tc>
+        <w:tc>
+          <w:tcPr>
+            <w:tcW w:type="dxa" w:w="1368"/>
+          </w:tcPr>
+          <w:p>
+            <w:pPr>
+              <w:spacing w:after="20"/>
+            </w:pPr>
+            <w:r>
+              <w:rPr>
+                <w:color w:val="1C3A36"/>
+                <w:sz w:val="15"/>
+              </w:rPr>
+              <w:t>4,595.5</w:t>
+            </w:r>
+          </w:p>
+        </w:tc>
+        <w:tc>
+          <w:tcPr>
+            <w:tcW w:type="dxa" w:w="1123"/>
+          </w:tcPr>
+          <w:p>
+            <w:pPr>
+              <w:spacing w:after="20"/>
+            </w:pPr>
+            <w:r>
+              <w:rPr>
+                <w:color w:val="1C3A36"/>
+                <w:sz w:val="15"/>
+              </w:rPr>
+              <w:t>2024-06-30</w:t>
+            </w:r>
+          </w:p>
+        </w:tc>
+        <w:tc>
+          <w:tcPr>
+            <w:tcW w:type="dxa" w:w="5933"/>
+          </w:tcPr>
+          <w:p>
+            <w:pPr>
+              <w:spacing w:after="20"/>
+            </w:pPr>
+            <w:r>
+              <w:rPr>
+                <w:color w:val="1C3A36"/>
+                <w:sz w:val="15"/>
+              </w:rPr>
+              <w:t>Reviewed condensed interim consolidated financial statements for the six months ended 30 June 2024, statement of cash flows, same line</w:t>
+            </w:r>
+          </w:p>
+        </w:tc>
+      </w:tr>
+      <w:tr>
+        <w:tc>
+          <w:tcPr>
+            <w:tcW w:type="dxa" w:w="1656"/>
+          </w:tcPr>
+          <w:p>
+            <w:pPr>
+              <w:spacing w:after="20"/>
+            </w:pPr>
+            <w:r>
+              <w:rPr>
+                <w:color w:val="1C3A36"/>
+                <w:sz w:val="15"/>
+              </w:rPr>
+              <w:t>capex h1 23</w:t>
+            </w:r>
+          </w:p>
+        </w:tc>
+        <w:tc>
+          <w:tcPr>
+            <w:tcW w:type="dxa" w:w="1368"/>
+          </w:tcPr>
+          <w:p>
+            <w:pPr>
+              <w:spacing w:after="20"/>
+            </w:pPr>
+            <w:r>
+              <w:rPr>
+                <w:color w:val="1C3A36"/>
+                <w:sz w:val="15"/>
+              </w:rPr>
+              <w:t>1,858.4</w:t>
+            </w:r>
+          </w:p>
+        </w:tc>
+        <w:tc>
+          <w:tcPr>
+            <w:tcW w:type="dxa" w:w="1123"/>
+          </w:tcPr>
+          <w:p>
+            <w:pPr>
+              <w:spacing w:after="20"/>
+            </w:pPr>
+            <w:r>
+              <w:rPr>
+                <w:color w:val="1C3A36"/>
+                <w:sz w:val="15"/>
+              </w:rPr>
+              <w:t>2023-06-30</w:t>
+            </w:r>
+          </w:p>
+        </w:tc>
+        <w:tc>
+          <w:tcPr>
+            <w:tcW w:type="dxa" w:w="5933"/>
+          </w:tcPr>
+          <w:p>
+            <w:pPr>
+              <w:spacing w:after="20"/>
+            </w:pPr>
+            <w:r>
+              <w:rPr>
+                <w:color w:val="1C3A36"/>
+                <w:sz w:val="15"/>
+              </w:rPr>
+              <w:t>Reviewed condensed interim consolidated financial statements for the six months ended 30 June 2024, same line, comparative column</w:t>
             </w:r>
           </w:p>
         </w:tc>
@@ -13420,7 +13770,7 @@
                 <w:color w:val="1C3A36"/>
                 <w:sz w:val="15"/>
               </w:rPr>
-              <w:t>Capex as a share of revenue, tapering from the FY2025 disclosed level of 4.7% (up from 3.1% FY2023 and 3.7% FY2024) toward a lower maintenance-plus-modest-capacity level as the current expansion cycle completes</w:t>
+              <w:t>THE RETIRED PATH, superseded 09-09-2026 and kept because the depth bar requires a displaced construction to be published beside the one that replaced it. It tapered from the FY2025 disclosed level of 4.7% (up from 3.1% FY2023 and 3.7% FY2024) toward a lower maintenance-plus-modest-capacity level as the expansion cycle completes — a House glide, on a story about the cycle, set before the reviewed half was read. The half measures the cycle directly: see capex_pct_measured below</w:t>
             </w:r>
           </w:p>
         </w:tc>

</xml_diff>

<commit_message>
SWDY artefacts rebuilt on the corrected terminal
Study, workbook and bibliography regenerated after the terminal risk-free was derived
from the house macro path. recalc reports every formula cell reproducing the model.

Co-Authored-By: Claude Opus 5 <noreply@anthropic.com>
Claude-Session: https://claude.ai/code/session_017RcjXG4ETjADcoFJf123yY
</commit_message>
<xml_diff>
--- a/engine/swdy_study/SWDY_Bibliography_09-09-2026.docx
+++ b/engine/swdy_study/SWDY_Bibliography_09-09-2026.docx
@@ -14156,7 +14156,7 @@
                 <w:color w:val="1C3A36"/>
                 <w:sz w:val="15"/>
               </w:rPr>
-              <w:t>0.105</w:t>
+              <w:t>0.125</w:t>
             </w:r>
           </w:p>
         </w:tc>
@@ -14173,7 +14173,7 @@
                 <w:color w:val="1C3A36"/>
                 <w:sz w:val="15"/>
               </w:rPr>
-              <w:t>2026-08-05</w:t>
+              <w:t>2026-09-09</w:t>
             </w:r>
           </w:p>
         </w:tc>
@@ -14190,7 +14190,7 @@
                 <w:color w:val="1C3A36"/>
                 <w:sz w:val="15"/>
               </w:rPr>
-              <w:t>Terminal risk-free rate, norm-built: the CBE's own stated medium-term inflation target of 5% plus the standard ~5.5pp emerging-market real-rate convention. Never a raw historical average and never reverse-engineered from a price</w:t>
+              <w:t>Terminal risk-free rate, DERIVED from the house macro path as the inflation target in force plus the real-rate convention, never typed: 7.00% + 5.50% = 12.50%. Revisions to 08-09-2026 carried 10.50%, built on a 5% inflation this study chose for itself while the terminal growth line four rows above used the house 7% and said the house path was the only source of an inflation rate here. Never a raw historical average and never reverse-engineered from a price</w:t>
             </w:r>
           </w:p>
         </w:tc>

</xml_diff>